<commit_message>
fix: correct footer Rev number and make tanggal berlaku dynamic
Rev was inconsistent (03/00) across footer variants and hardcoded to
a static date. Rev is now fixed at 01 and "Tanggal berlaku" reflects
the actual staff approval date (evalTanggal) per submission.

Co-Authored-By: Claude Sonnet 5 <noreply@anthropic.com>
</commit_message>
<xml_diff>
--- a/templates/template.docx
+++ b/templates/template.docx
@@ -3091,7 +3091,7 @@
         <w:sz w:val="20"/>
         <w:lang w:val="id-ID"/>
       </w:rPr>
-      <w:t>3</w:t>
+      <w:t>1</w:t>
     </w:r>
     <w:r>
       <w:rPr>
@@ -3192,7 +3192,7 @@
         <w:sz w:val="20"/>
         <w:lang w:val="id-ID"/>
       </w:rPr>
-      <w:t>19 Juli 2024</w:t>
+      <w:t>{tanggal_berlaku}</w:t>
     </w:r>
   </w:p>
 </w:ftr>
@@ -3251,7 +3251,7 @@
         <w:rFonts w:ascii="Times New Roman" w:hAnsi="Times New Roman"/>
         <w:sz w:val="20"/>
       </w:rPr>
-      <w:t>Rev. 00</w:t>
+      <w:t>Rev. 01</w:t>
     </w:r>
     <w:r>
       <w:rPr>
@@ -3368,7 +3368,7 @@
         <w:lang w:val="id-ID"/>
       </w:rPr>
       <w:tab/>
-      <w:t>Tanggal berlaku : 21 Desember 2022</w:t>
+      <w:t>Tanggal berlaku : {tanggal_berlaku}</w:t>
     </w:r>
     <w:r>
       <w:rPr>
@@ -3439,7 +3439,7 @@
         <w:sz w:val="20"/>
         <w:lang w:val="id-ID"/>
       </w:rPr>
-      <w:t>3</w:t>
+      <w:t>1</w:t>
     </w:r>
     <w:r>
       <w:rPr>
@@ -3540,7 +3540,7 @@
         <w:sz w:val="20"/>
         <w:lang w:val="id-ID"/>
       </w:rPr>
-      <w:t>19 Juli 2024</w:t>
+      <w:t>{tanggal_berlaku}</w:t>
     </w:r>
   </w:p>
 </w:ftr>

</xml_diff>

<commit_message>
fix: correct footer Rev to static 002, ignore Vercel local files
No. Dok / Rev in the footer are fixed document-control metadata for
this form (not per-submission), so Rev is corrected to a static
"002" instead of matching the nomor_surat increment scheme.

Co-Authored-By: Claude Sonnet 5 <noreply@anthropic.com>
</commit_message>
<xml_diff>
--- a/templates/template.docx
+++ b/templates/template.docx
@@ -3091,7 +3091,7 @@
         <w:sz w:val="20"/>
         <w:lang w:val="id-ID"/>
       </w:rPr>
-      <w:t>1</w:t>
+      <w:t>02</w:t>
     </w:r>
     <w:r>
       <w:rPr>
@@ -3251,7 +3251,7 @@
         <w:rFonts w:ascii="Times New Roman" w:hAnsi="Times New Roman"/>
         <w:sz w:val="20"/>
       </w:rPr>
-      <w:t>Rev. 01</w:t>
+      <w:t>Rev. 002</w:t>
     </w:r>
     <w:r>
       <w:rPr>
@@ -3439,7 +3439,7 @@
         <w:sz w:val="20"/>
         <w:lang w:val="id-ID"/>
       </w:rPr>
-      <w:t>1</w:t>
+      <w:t>02</w:t>
     </w:r>
     <w:r>
       <w:rPr>

</xml_diff>

<commit_message>
Revamp CERTINDO calibration application
</commit_message>
<xml_diff>
--- a/templates/template.docx
+++ b/templates/template.docx
@@ -1,6 +1,6 @@
 
 <file path=word/document.xml><?xml version="1.0" encoding="utf-8"?>
-<w:document xmlns:wpc="http://schemas.microsoft.com/office/word/2010/wordprocessingCanvas" xmlns:cx="http://schemas.microsoft.com/office/drawing/2014/chartex" xmlns:cx1="http://schemas.microsoft.com/office/drawing/2015/9/8/chartex" xmlns:cx2="http://schemas.microsoft.com/office/drawing/2015/10/21/chartex" xmlns:cx3="http://schemas.microsoft.com/office/drawing/2016/5/9/chartex" xmlns:cx4="http://schemas.microsoft.com/office/drawing/2016/5/10/chartex" xmlns:cx5="http://schemas.microsoft.com/office/drawing/2016/5/11/chartex" xmlns:cx6="http://schemas.microsoft.com/office/drawing/2016/5/12/chartex" xmlns:cx7="http://schemas.microsoft.com/office/drawing/2016/5/13/chartex" xmlns:cx8="http://schemas.microsoft.com/office/drawing/2016/5/14/chartex" xmlns:mc="http://schemas.openxmlformats.org/markup-compatibility/2006" xmlns:aink="http://schemas.microsoft.com/office/drawing/2016/ink" xmlns:am3d="http://schemas.microsoft.com/office/drawing/2017/model3d" xmlns:o="urn:schemas-microsoft-com:office:office" xmlns:oel="http://schemas.microsoft.com/office/2019/extlst" xmlns:r="http://schemas.openxmlformats.org/officeDocument/2006/relationships" xmlns:m="http://schemas.openxmlformats.org/officeDocument/2006/math" xmlns:v="urn:schemas-microsoft-com:vml" xmlns:wp14="http://schemas.microsoft.com/office/word/2010/wordprocessingDrawing" xmlns:wp="http://schemas.openxmlformats.org/drawingml/2006/wordprocessingDrawing" xmlns:w10="urn:schemas-microsoft-com:office:word" xmlns:w="http://schemas.openxmlformats.org/wordprocessingml/2006/main" xmlns:w14="http://schemas.microsoft.com/office/word/2010/wordml" xmlns:w15="http://schemas.microsoft.com/office/word/2012/wordml" xmlns:w16cex="http://schemas.microsoft.com/office/word/2018/wordml/cex" xmlns:w16cid="http://schemas.microsoft.com/office/word/2016/wordml/cid" xmlns:w16="http://schemas.microsoft.com/office/word/2018/wordml" xmlns:w16du="http://schemas.microsoft.com/office/word/2023/wordml/word16du" xmlns:w16sdtdh="http://schemas.microsoft.com/office/word/2020/wordml/sdtdatahash" xmlns:w16sdtfl="http://schemas.microsoft.com/office/word/2024/wordml/sdtformatlock" xmlns:w16se="http://schemas.microsoft.com/office/word/2015/wordml/symex" xmlns:wpg="http://schemas.microsoft.com/office/word/2010/wordprocessingGroup" xmlns:wpi="http://schemas.microsoft.com/office/word/2010/wordprocessingInk" xmlns:wne="http://schemas.microsoft.com/office/word/2006/wordml" xmlns:wps="http://schemas.microsoft.com/office/word/2010/wordprocessingShape" mc:Ignorable="w14 w15 w16se w16cid w16 w16cex w16sdtdh w16sdtfl w16du wp14">
+<w:document xmlns:pic="http://schemas.openxmlformats.org/drawingml/2006/picture" xmlns:wpc="http://schemas.microsoft.com/office/word/2010/wordprocessingCanvas" xmlns:cx="http://schemas.microsoft.com/office/drawing/2014/chartex" xmlns:cx1="http://schemas.microsoft.com/office/drawing/2015/9/8/chartex" xmlns:cx2="http://schemas.microsoft.com/office/drawing/2015/10/21/chartex" xmlns:cx3="http://schemas.microsoft.com/office/drawing/2016/5/9/chartex" xmlns:cx4="http://schemas.microsoft.com/office/drawing/2016/5/10/chartex" xmlns:cx5="http://schemas.microsoft.com/office/drawing/2016/5/11/chartex" xmlns:cx6="http://schemas.microsoft.com/office/drawing/2016/5/12/chartex" xmlns:cx7="http://schemas.microsoft.com/office/drawing/2016/5/13/chartex" xmlns:cx8="http://schemas.microsoft.com/office/drawing/2016/5/14/chartex" xmlns:mc="http://schemas.openxmlformats.org/markup-compatibility/2006" xmlns:aink="http://schemas.microsoft.com/office/drawing/2016/ink" xmlns:am3d="http://schemas.microsoft.com/office/drawing/2017/model3d" xmlns:o="urn:schemas-microsoft-com:office:office" xmlns:oel="http://schemas.microsoft.com/office/2019/extlst" xmlns:r="http://schemas.openxmlformats.org/officeDocument/2006/relationships" xmlns:m="http://schemas.openxmlformats.org/officeDocument/2006/math" xmlns:v="urn:schemas-microsoft-com:vml" xmlns:wp14="http://schemas.microsoft.com/office/word/2010/wordprocessingDrawing" xmlns:wp="http://schemas.openxmlformats.org/drawingml/2006/wordprocessingDrawing" xmlns:w10="urn:schemas-microsoft-com:office:word" xmlns:w="http://schemas.openxmlformats.org/wordprocessingml/2006/main" xmlns:w14="http://schemas.microsoft.com/office/word/2010/wordml" xmlns:w15="http://schemas.microsoft.com/office/word/2012/wordml" xmlns:w16cex="http://schemas.microsoft.com/office/word/2018/wordml/cex" xmlns:w16cid="http://schemas.microsoft.com/office/word/2016/wordml/cid" xmlns:w16="http://schemas.microsoft.com/office/word/2018/wordml" xmlns:w16du="http://schemas.microsoft.com/office/word/2023/wordml/word16du" xmlns:w16sdtdh="http://schemas.microsoft.com/office/word/2020/wordml/sdtdatahash" xmlns:w16sdtfl="http://schemas.microsoft.com/office/word/2024/wordml/sdtformatlock" xmlns:w16se="http://schemas.microsoft.com/office/word/2015/wordml/symex" xmlns:wpg="http://schemas.microsoft.com/office/word/2010/wordprocessingGroup" xmlns:wpi="http://schemas.microsoft.com/office/word/2010/wordprocessingInk" xmlns:wne="http://schemas.microsoft.com/office/word/2006/wordml" xmlns:wps="http://schemas.microsoft.com/office/word/2010/wordprocessingShape" mc:Ignorable="w14 w15 w16se w16cid w16 w16cex w16sdtdh w16sdtfl w16du wp14">
   <w:body>
     <w:p>
       <w:pPr>
@@ -764,7 +764,7 @@
                 <w:szCs w:val="30"/>
                 <w:lang w:val="en-GB" w:eastAsia="zh-CN"/>
               </w:rPr>
-              <w:t xml:space="preserve">{#cek_lab}√{/cek_lab}{^cek_lab}□{/cek_lab} </w:t>
+              <w:t xml:space="preserve">{#cek_in_our_lab}√{/cek_in_our_lab}{^cek_in_our_lab}□{/cek_in_our_lab} </w:t>
             </w:r>
             <w:r>
               <w:rPr>
@@ -772,7 +772,7 @@
                 <w:sz w:val="20"/>
                 <w:lang w:val="id-ID" w:eastAsia="zh-CN"/>
               </w:rPr>
-              <w:t>Lab PT Certindonesia</w:t>
+              <w:t>In Our Lab</w:t>
             </w:r>
           </w:p>
         </w:tc>
@@ -803,7 +803,7 @@
                 <w:szCs w:val="30"/>
                 <w:lang w:val="en-GB" w:eastAsia="zh-CN"/>
               </w:rPr>
-              <w:t>{#cek_insitu}√{/cek_insitu}{^cek_insitu}□{/cek_insitu}</w:t>
+              <w:t>{#cek_on_site}√{/cek_on_site}{^cek_on_site}□{/cek_on_site}</w:t>
             </w:r>
             <w:r>
               <w:rPr>
@@ -819,7 +819,25 @@
                 <w:sz w:val="20"/>
                 <w:lang w:val="id-ID" w:eastAsia="zh-CN"/>
               </w:rPr>
-              <w:t>Insitu</w:t>
+              <w:t>On Site</w:t>
+            </w:r>
+            <w:r>
+              <w:br/>
+            </w:r>
+            <w:r>
+              <w:rPr>
+                <w:rFonts w:ascii="Arial" w:hAnsi="Arial"/>
+                <w:sz w:val="30"/>
+                <w:szCs w:val="30"/>
+              </w:rPr>
+              <w:t>{#cek_hybrid}√{/cek_hybrid}{^cek_hybrid}□{/cek_hybrid}</w:t>
+            </w:r>
+            <w:r>
+              <w:rPr>
+                <w:rFonts w:ascii="Arial" w:hAnsi="Arial"/>
+                <w:sz w:val="20"/>
+              </w:rPr>
+              <w:t xml:space="preserve"> Hybrid - In Our Lab &amp; On Site</w:t>
             </w:r>
           </w:p>
         </w:tc>
@@ -944,130 +962,6 @@
                 <w:lang w:val="id-ID" w:eastAsia="zh-CN"/>
               </w:rPr>
               <w:t>Percepatan</w:t>
-            </w:r>
-          </w:p>
-        </w:tc>
-      </w:tr>
-      <w:tr>
-        <w:trPr>
-          <w:trHeight w:val="397"/>
-        </w:trPr>
-        <w:tc>
-          <w:tcPr>
-            <w:tcW w:w="2520" w:type="dxa"/>
-            <w:shd w:val="clear" w:color="auto" w:fill="D9D9D9"/>
-            <w:vAlign w:val="center"/>
-          </w:tcPr>
-          <w:p>
-            <w:pPr>
-              <w:spacing w:after="0"/>
-              <w:jc w:val="left"/>
-              <w:rPr>
-                <w:rFonts w:ascii="Arial" w:hAnsi="Arial" w:cs="Arial"/>
-                <w:i/>
-                <w:iCs/>
-                <w:color w:val="000000"/>
-                <w:sz w:val="20"/>
-                <w:lang w:val="en-US"/>
-              </w:rPr>
-            </w:pPr>
-            <w:r>
-              <w:rPr>
-                <w:rFonts w:ascii="Arial" w:hAnsi="Arial" w:cs="Arial"/>
-                <w:i/>
-                <w:iCs/>
-                <w:color w:val="000000"/>
-                <w:sz w:val="20"/>
-                <w:lang w:val="en-US"/>
-              </w:rPr>
-              <w:t xml:space="preserve">Penambahan Tenggat Kalibrasi pada Sertifikat</w:t>
-            </w:r>
-          </w:p>
-        </w:tc>
-        <w:tc>
-          <w:tcPr>
-            <w:tcW w:w="3420" w:type="dxa"/>
-            <w:gridSpan w:val="2"/>
-            <w:shd w:val="clear" w:color="auto" w:fill="FFFFFF"/>
-            <w:vAlign w:val="center"/>
-          </w:tcPr>
-          <w:p>
-            <w:pPr>
-              <w:overflowPunct/>
-              <w:autoSpaceDE/>
-              <w:autoSpaceDN/>
-              <w:adjustRightInd/>
-              <w:spacing w:after="0"/>
-              <w:jc w:val="left"/>
-              <w:textAlignment w:val="auto"/>
-              <w:rPr>
-                <w:rFonts w:ascii="Arial" w:hAnsi="Arial" w:cs="Arial"/>
-                <w:sz w:val="30"/>
-                <w:szCs w:val="30"/>
-                <w:lang w:val="en-GB" w:eastAsia="zh-CN"/>
-              </w:rPr>
-            </w:pPr>
-            <w:r>
-              <w:rPr>
-                <w:rFonts w:ascii="Arial" w:hAnsi="Arial" w:cs="Arial"/>
-                <w:sz w:val="30"/>
-                <w:szCs w:val="30"/>
-                <w:lang w:val="en-GB" w:eastAsia="zh-CN"/>
-              </w:rPr>
-              <w:t>{#cek_tenggat_ya}√{/cek_tenggat_ya}{^cek_tenggat_ya}□{/cek_tenggat_ya}</w:t>
-            </w:r>
-            <w:r>
-              <w:rPr>
-                <w:rFonts w:ascii="Arial" w:hAnsi="Arial" w:cs="Arial"/>
-                <w:sz w:val="20"/>
-                <w:lang w:val="en-GB" w:eastAsia="zh-CN"/>
-              </w:rPr>
-              <w:t xml:space="preserve"> </w:t>
-            </w:r>
-            <w:r>
-              <w:rPr>
-                <w:rFonts w:ascii="Arial" w:hAnsi="Arial" w:cs="Arial"/>
-                <w:sz w:val="20"/>
-                <w:lang w:val="id-ID" w:eastAsia="zh-CN"/>
-              </w:rPr>
-              <w:t>Ya</w:t>
-            </w:r>
-          </w:p>
-        </w:tc>
-        <w:tc>
-          <w:tcPr>
-            <w:tcW w:w="3690" w:type="dxa"/>
-            <w:gridSpan w:val="2"/>
-            <w:shd w:val="clear" w:color="auto" w:fill="FFFFFF"/>
-            <w:vAlign w:val="center"/>
-          </w:tcPr>
-          <w:p>
-            <w:pPr>
-              <w:spacing w:after="0"/>
-              <w:jc w:val="left"/>
-              <w:rPr>
-                <w:rFonts w:ascii="Arial" w:hAnsi="Arial" w:cs="Arial"/>
-                <w:sz w:val="30"/>
-                <w:szCs w:val="30"/>
-                <w:lang w:val="en-GB" w:eastAsia="zh-CN"/>
-              </w:rPr>
-            </w:pPr>
-            <w:r>
-              <w:rPr>
-                <w:rFonts w:ascii="Arial" w:hAnsi="Arial" w:cs="Arial"/>
-                <w:sz w:val="30"/>
-                <w:szCs w:val="30"/>
-                <w:lang w:val="en-GB" w:eastAsia="zh-CN"/>
-              </w:rPr>
-              <w:t xml:space="preserve">{#cek_tenggat_tidak}√{/cek_tenggat_tidak}{^cek_tenggat_tidak}□{/cek_tenggat_tidak} </w:t>
-            </w:r>
-            <w:r>
-              <w:rPr>
-                <w:rFonts w:ascii="Arial" w:hAnsi="Arial" w:cs="Arial"/>
-                <w:sz w:val="20"/>
-                <w:lang w:val="id-ID" w:eastAsia="zh-CN"/>
-              </w:rPr>
-              <w:t>Tidak</w:t>
             </w:r>
           </w:p>
         </w:tc>
@@ -1741,23 +1635,8 @@
                                   <w:pPr>
                                     <w:jc w:val="center"/>
                                   </w:pPr>
-                                </w:p>
-                                <w:p>
-                                  <w:pPr>
-                                    <w:jc w:val="center"/>
-                                  </w:pPr>
-                                </w:p>
-                                <w:p>
-                                  <w:pPr>
-                                    <w:jc w:val="center"/>
-                                  </w:pPr>
-                                </w:p>
-                                <w:p>
-                                  <w:pPr>
-                                    <w:jc w:val="center"/>
-                                  </w:pPr>
                                   <w:r>
-                                    <w:t>({nama_staf_teknis})</w:t>
+                                    <w:t/>
                                   </w:r>
                                 </w:p>
                               </w:txbxContent>
@@ -1806,23 +1685,8 @@
                             <w:pPr>
                               <w:jc w:val="center"/>
                             </w:pPr>
-                          </w:p>
-                          <w:p>
-                            <w:pPr>
-                              <w:jc w:val="center"/>
-                            </w:pPr>
-                          </w:p>
-                          <w:p>
-                            <w:pPr>
-                              <w:jc w:val="center"/>
-                            </w:pPr>
-                          </w:p>
-                          <w:p>
-                            <w:pPr>
-                              <w:jc w:val="center"/>
-                            </w:pPr>
                             <w:r>
-                              <w:t>({nama_staf_teknis})</w:t>
+                              <w:t/>
                             </w:r>
                           </w:p>
                         </w:txbxContent>
@@ -1887,30 +1751,57 @@
                                     <w:jc w:val="center"/>
                                   </w:pPr>
                                   <w:r>
-                                    <w:t xml:space="preserve">Manajer Teknis</w:t>
+                                    <w:t>Manajer Teknis</w:t>
                                   </w:r>
                                 </w:p>
                                 <w:p>
                                   <w:pPr>
                                     <w:jc w:val="center"/>
                                   </w:pPr>
-                                </w:p>
-                                <w:p>
-                                  <w:pPr>
-                                    <w:jc w:val="center"/>
-                                  </w:pPr>
-                                </w:p>
-                                <w:p>
-                                  <w:pPr>
-                                    <w:jc w:val="center"/>
-                                  </w:pPr>
+                                  <w:r>
+                                    <w:drawing>
+                                      <wp:inline distT="0" distB="0" distL="0" distR="0">
+                                        <wp:extent cx="720000" cy="720000"/>
+                                        <wp:effectExtent l="0" t="0" r="0" b="0"/>
+                                        <wp:docPr id="9001" name="Tanda tangan dan cap Manajer Teknis" descr="Tanda tangan dan cap Manajer Teknis"/>
+                                        <wp:cNvGraphicFramePr>
+                                          <a:graphicFrameLocks noChangeAspect="1"/>
+                                        </wp:cNvGraphicFramePr>
+                                        <a:graphic>
+                                          <a:graphicData uri="http://schemas.openxmlformats.org/drawingml/2006/picture">
+                                            <pic:pic>
+                                              <pic:nvPicPr>
+                                                <pic:cNvPr id="0" name="ttd-manager-certindo.png" descr="Tanda tangan dan cap Manajer Teknis"/>
+                                                <pic:cNvPicPr/>
+                                              </pic:nvPicPr>
+                                              <pic:blipFill>
+                                                <a:blip r:embed="rId16"/>
+                                                <a:stretch>
+                                                  <a:fillRect/>
+                                                </a:stretch>
+                                              </pic:blipFill>
+                                              <pic:spPr>
+                                                <a:xfrm>
+                                                  <a:off x="0" y="0"/>
+                                                  <a:ext cx="720000" cy="720000"/>
+                                                </a:xfrm>
+                                                <a:prstGeom prst="rect">
+                                                  <a:avLst/>
+                                                </a:prstGeom>
+                                              </pic:spPr>
+                                            </pic:pic>
+                                          </a:graphicData>
+                                        </a:graphic>
+                                      </wp:inline>
+                                    </w:drawing>
+                                  </w:r>
                                 </w:p>
                                 <w:p>
                                   <w:pPr>
                                     <w:jc w:val="center"/>
                                   </w:pPr>
                                   <w:r>
-                                    <w:t>({nama_manajer_teknis})</w:t>
+                                    <w:t/>
                                   </w:r>
                                 </w:p>
                               </w:txbxContent>
@@ -1971,7 +1862,7 @@
                               <w:jc w:val="center"/>
                             </w:pPr>
                             <w:r>
-                              <w:t>({nama_manajer_teknis})</w:t>
+                              <w:t/>
                             </w:r>
                           </w:p>
                         </w:txbxContent>
@@ -2485,14 +2376,10 @@
         <w:tblLook w:val="0000" w:firstRow="0" w:lastRow="0" w:firstColumn="0" w:lastColumn="0" w:noHBand="0" w:noVBand="0"/>
       </w:tblPr>
       <w:tblGrid>
-        <w:gridCol w:w="690"/>
-        <w:gridCol w:w="2552"/>
-        <w:gridCol w:w="1843"/>
-        <w:gridCol w:w="1984"/>
-        <w:gridCol w:w="1867"/>
-        <w:gridCol w:w="1984"/>
-        <w:gridCol w:w="993"/>
-        <w:gridCol w:w="2385"/>
+        <w:gridCol w:w="850"/>
+        <w:gridCol w:w="6200"/>
+        <w:gridCol w:w="5300"/>
+        <w:gridCol w:w="1948"/>
       </w:tblGrid>
       <w:tr>
         <w:trPr>
@@ -2500,7 +2387,7 @@
         </w:trPr>
         <w:tc>
           <w:tcPr>
-            <w:tcW w:w="690" w:type="dxa"/>
+            <w:tcW w:w="850" w:type="dxa"/>
             <w:vAlign w:val="center"/>
           </w:tcPr>
           <w:p>
@@ -2549,7 +2436,7 @@
         </w:tc>
         <w:tc>
           <w:tcPr>
-            <w:tcW w:w="2552" w:type="dxa"/>
+            <w:tcW w:w="6200" w:type="dxa"/>
             <w:vAlign w:val="center"/>
           </w:tcPr>
           <w:p>
@@ -2578,7 +2465,35 @@
         </w:tc>
         <w:tc>
           <w:tcPr>
-            <w:tcW w:w="1843" w:type="dxa"/>
+            <w:tcW w:w="5300" w:type="dxa"/>
+          </w:tcPr>
+          <w:p>
+            <w:pPr>
+              <w:spacing w:after="0"/>
+              <w:jc w:val="center"/>
+              <w:rPr>
+                <w:rFonts w:ascii="Times New Roman" w:hAnsi="Times New Roman"/>
+                <w:b/>
+                <w:sz w:val="24"/>
+                <w:szCs w:val="24"/>
+                <w:lang w:val="en-US"/>
+              </w:rPr>
+            </w:pPr>
+            <w:r>
+              <w:rPr>
+                <w:rFonts w:ascii="Times New Roman" w:hAnsi="Times New Roman"/>
+                <w:b/>
+                <w:sz w:val="24"/>
+                <w:szCs w:val="24"/>
+                <w:lang w:val="en-US"/>
+              </w:rPr>
+              <w:t xml:space="preserve">Range Kalibrasi</w:t>
+            </w:r>
+          </w:p>
+        </w:tc>
+        <w:tc>
+          <w:tcPr>
+            <w:tcW w:w="1948" w:type="dxa"/>
             <w:vAlign w:val="center"/>
           </w:tcPr>
           <w:p>
@@ -2601,151 +2516,7 @@
                 <w:szCs w:val="24"/>
                 <w:lang w:val="id-ID"/>
               </w:rPr>
-              <w:t>Merek</w:t>
-            </w:r>
-          </w:p>
-        </w:tc>
-        <w:tc>
-          <w:tcPr>
-            <w:tcW w:w="1984" w:type="dxa"/>
-            <w:vAlign w:val="center"/>
-          </w:tcPr>
-          <w:p>
-            <w:pPr>
-              <w:spacing w:after="0"/>
-              <w:jc w:val="center"/>
-              <w:rPr>
-                <w:rFonts w:ascii="Times New Roman" w:hAnsi="Times New Roman"/>
-                <w:b/>
-                <w:sz w:val="24"/>
-                <w:szCs w:val="24"/>
-                <w:lang w:val="id-ID"/>
-              </w:rPr>
-            </w:pPr>
-            <w:r>
-              <w:rPr>
-                <w:rFonts w:ascii="Times New Roman" w:hAnsi="Times New Roman"/>
-                <w:b/>
-                <w:sz w:val="24"/>
-                <w:szCs w:val="24"/>
-                <w:lang w:val="id-ID"/>
-              </w:rPr>
-              <w:t>Tipe</w:t>
-            </w:r>
-          </w:p>
-        </w:tc>
-        <w:tc>
-          <w:tcPr>
-            <w:tcW w:w="1867" w:type="dxa"/>
-            <w:vAlign w:val="center"/>
-          </w:tcPr>
-          <w:p>
-            <w:pPr>
-              <w:spacing w:after="0"/>
-              <w:jc w:val="center"/>
-              <w:rPr>
-                <w:rFonts w:ascii="Times New Roman" w:hAnsi="Times New Roman"/>
-                <w:b/>
-                <w:sz w:val="24"/>
-                <w:szCs w:val="24"/>
-                <w:lang w:val="id-ID"/>
-              </w:rPr>
-            </w:pPr>
-            <w:r>
-              <w:rPr>
-                <w:rFonts w:ascii="Times New Roman" w:hAnsi="Times New Roman"/>
-                <w:b/>
-                <w:sz w:val="24"/>
-                <w:szCs w:val="24"/>
-                <w:lang w:val="id-ID"/>
-              </w:rPr>
-              <w:t>No. Seri</w:t>
-            </w:r>
-          </w:p>
-        </w:tc>
-        <w:tc>
-          <w:tcPr>
-            <w:tcW w:w="1984" w:type="dxa"/>
-          </w:tcPr>
-          <w:p>
-            <w:pPr>
-              <w:spacing w:after="0"/>
-              <w:jc w:val="center"/>
-              <w:rPr>
-                <w:rFonts w:ascii="Times New Roman" w:hAnsi="Times New Roman"/>
-                <w:b/>
-                <w:sz w:val="24"/>
-                <w:szCs w:val="24"/>
-                <w:lang w:val="en-US"/>
-              </w:rPr>
-            </w:pPr>
-            <w:r>
-              <w:rPr>
-                <w:rFonts w:ascii="Times New Roman" w:hAnsi="Times New Roman"/>
-                <w:b/>
-                <w:sz w:val="24"/>
-                <w:szCs w:val="24"/>
-                <w:lang w:val="en-US"/>
-              </w:rPr>
-              <w:t xml:space="preserve">Range Kalibrasi</w:t>
-            </w:r>
-          </w:p>
-        </w:tc>
-        <w:tc>
-          <w:tcPr>
-            <w:tcW w:w="993" w:type="dxa"/>
-            <w:vAlign w:val="center"/>
-          </w:tcPr>
-          <w:p>
-            <w:pPr>
-              <w:spacing w:after="0"/>
-              <w:jc w:val="center"/>
-              <w:rPr>
-                <w:rFonts w:ascii="Times New Roman" w:hAnsi="Times New Roman"/>
-                <w:b/>
-                <w:sz w:val="24"/>
-                <w:szCs w:val="24"/>
-                <w:lang w:val="id-ID"/>
-              </w:rPr>
-            </w:pPr>
-            <w:r>
-              <w:rPr>
-                <w:rFonts w:ascii="Times New Roman" w:hAnsi="Times New Roman"/>
-                <w:b/>
-                <w:sz w:val="24"/>
-                <w:szCs w:val="24"/>
-                <w:lang w:val="id-ID"/>
-              </w:rPr>
               <w:t>Jumlah</w:t>
-            </w:r>
-          </w:p>
-        </w:tc>
-        <w:tc>
-          <w:tcPr>
-            <w:tcW w:w="2385" w:type="dxa"/>
-            <w:vAlign w:val="center"/>
-          </w:tcPr>
-          <w:p>
-            <w:pPr>
-              <w:spacing w:after="0"/>
-              <w:jc w:val="center"/>
-              <w:rPr>
-                <w:rFonts w:ascii="Times New Roman" w:hAnsi="Times New Roman"/>
-                <w:b/>
-                <w:sz w:val="24"/>
-                <w:szCs w:val="24"/>
-                <w:lang w:val="en-US"/>
-              </w:rPr>
-            </w:pPr>
-            <w:r>
-              <w:rPr>
-                <w:rFonts w:ascii="Times New Roman" w:hAnsi="Times New Roman"/>
-                <w:b/>
-                <w:sz w:val="24"/>
-                <w:szCs w:val="24"/>
-                <w:lang w:val="en-US"/>
-              </w:rPr>
-              <w:t xml:space="preserve">Cek Kesesuaian*</w:t>
             </w:r>
           </w:p>
         </w:tc>
@@ -2757,7 +2528,7 @@
         </w:trPr>
         <w:tc>
           <w:tcPr>
-            <w:tcW w:w="690" w:type="dxa"/>
+            <w:tcW w:w="850" w:type="dxa"/>
             <w:vAlign w:val="center"/>
           </w:tcPr>
           <w:p>
@@ -2786,7 +2557,7 @@
         </w:tc>
         <w:tc>
           <w:tcPr>
-            <w:tcW w:w="2552" w:type="dxa"/>
+            <w:tcW w:w="6200" w:type="dxa"/>
             <w:vAlign w:val="center"/>
           </w:tcPr>
           <w:p>
@@ -2815,7 +2586,33 @@
         </w:tc>
         <w:tc>
           <w:tcPr>
-            <w:tcW w:w="1843" w:type="dxa"/>
+            <w:tcW w:w="5300" w:type="dxa"/>
+          </w:tcPr>
+          <w:p>
+            <w:pPr>
+              <w:spacing w:after="0"/>
+              <w:jc w:val="center"/>
+              <w:rPr>
+                <w:rFonts w:ascii="Times New Roman" w:hAnsi="Times New Roman"/>
+                <w:sz w:val="24"/>
+                <w:szCs w:val="24"/>
+                <w:lang w:val="id-ID"/>
+              </w:rPr>
+            </w:pPr>
+            <w:r>
+              <w:rPr>
+                <w:rFonts w:ascii="Times New Roman" w:hAnsi="Times New Roman"/>
+                <w:sz w:val="24"/>
+                <w:szCs w:val="24"/>
+                <w:lang w:val="id-ID"/>
+              </w:rPr>
+              <w:t>{range_kalibrasi}</w:t>
+            </w:r>
+          </w:p>
+        </w:tc>
+        <w:tc>
+          <w:tcPr>
+            <w:tcW w:w="1948" w:type="dxa"/>
             <w:vAlign w:val="center"/>
           </w:tcPr>
           <w:p>
@@ -2836,139 +2633,7 @@
                 <w:szCs w:val="24"/>
                 <w:lang w:val="id-ID"/>
               </w:rPr>
-              <w:t>{merek}</w:t>
-            </w:r>
-          </w:p>
-        </w:tc>
-        <w:tc>
-          <w:tcPr>
-            <w:tcW w:w="1984" w:type="dxa"/>
-            <w:vAlign w:val="center"/>
-          </w:tcPr>
-          <w:p>
-            <w:pPr>
-              <w:spacing w:after="0"/>
-              <w:jc w:val="center"/>
-              <w:rPr>
-                <w:rFonts w:ascii="Times New Roman" w:hAnsi="Times New Roman"/>
-                <w:sz w:val="24"/>
-                <w:szCs w:val="24"/>
-                <w:lang w:val="id-ID"/>
-              </w:rPr>
-            </w:pPr>
-            <w:r>
-              <w:rPr>
-                <w:rFonts w:ascii="Times New Roman" w:hAnsi="Times New Roman"/>
-                <w:sz w:val="24"/>
-                <w:szCs w:val="24"/>
-                <w:lang w:val="id-ID"/>
-              </w:rPr>
-              <w:t>{tipe}</w:t>
-            </w:r>
-          </w:p>
-        </w:tc>
-        <w:tc>
-          <w:tcPr>
-            <w:tcW w:w="1867" w:type="dxa"/>
-            <w:vAlign w:val="center"/>
-          </w:tcPr>
-          <w:p>
-            <w:pPr>
-              <w:spacing w:after="0"/>
-              <w:jc w:val="center"/>
-              <w:rPr>
-                <w:rFonts w:ascii="Times New Roman" w:hAnsi="Times New Roman"/>
-                <w:sz w:val="24"/>
-                <w:szCs w:val="24"/>
-                <w:lang w:val="id-ID"/>
-              </w:rPr>
-            </w:pPr>
-            <w:r>
-              <w:rPr>
-                <w:rFonts w:ascii="Times New Roman" w:hAnsi="Times New Roman"/>
-                <w:sz w:val="24"/>
-                <w:szCs w:val="24"/>
-                <w:lang w:val="id-ID"/>
-              </w:rPr>
-              <w:t>{no_seri}</w:t>
-            </w:r>
-          </w:p>
-        </w:tc>
-        <w:tc>
-          <w:tcPr>
-            <w:tcW w:w="1984" w:type="dxa"/>
-          </w:tcPr>
-          <w:p>
-            <w:pPr>
-              <w:spacing w:after="0"/>
-              <w:jc w:val="center"/>
-              <w:rPr>
-                <w:rFonts w:ascii="Times New Roman" w:hAnsi="Times New Roman"/>
-                <w:sz w:val="24"/>
-                <w:szCs w:val="24"/>
-                <w:lang w:val="id-ID"/>
-              </w:rPr>
-            </w:pPr>
-            <w:r>
-              <w:rPr>
-                <w:rFonts w:ascii="Times New Roman" w:hAnsi="Times New Roman"/>
-                <w:sz w:val="24"/>
-                <w:szCs w:val="24"/>
-                <w:lang w:val="id-ID"/>
-              </w:rPr>
-              <w:t>{range_kalibrasi}</w:t>
-            </w:r>
-          </w:p>
-        </w:tc>
-        <w:tc>
-          <w:tcPr>
-            <w:tcW w:w="993" w:type="dxa"/>
-            <w:vAlign w:val="center"/>
-          </w:tcPr>
-          <w:p>
-            <w:pPr>
-              <w:spacing w:after="0"/>
-              <w:jc w:val="center"/>
-              <w:rPr>
-                <w:rFonts w:ascii="Times New Roman" w:hAnsi="Times New Roman"/>
-                <w:sz w:val="24"/>
-                <w:szCs w:val="24"/>
-                <w:lang w:val="id-ID"/>
-              </w:rPr>
-            </w:pPr>
-            <w:r>
-              <w:rPr>
-                <w:rFonts w:ascii="Times New Roman" w:hAnsi="Times New Roman"/>
-                <w:sz w:val="24"/>
-                <w:szCs w:val="24"/>
-                <w:lang w:val="id-ID"/>
-              </w:rPr>
-              <w:t>{jumlah}</w:t>
-            </w:r>
-          </w:p>
-        </w:tc>
-        <w:tc>
-          <w:tcPr>
-            <w:tcW w:w="2385" w:type="dxa"/>
-          </w:tcPr>
-          <w:p>
-            <w:pPr>
-              <w:spacing w:after="0"/>
-              <w:rPr>
-                <w:rFonts w:ascii="Times New Roman" w:hAnsi="Times New Roman"/>
-                <w:sz w:val="24"/>
-                <w:szCs w:val="24"/>
-                <w:lang w:val="id-ID"/>
-              </w:rPr>
-            </w:pPr>
-            <w:r>
-              <w:rPr>
-                <w:rFonts w:ascii="Times New Roman" w:hAnsi="Times New Roman"/>
-                <w:sz w:val="24"/>
-                <w:szCs w:val="24"/>
-                <w:lang w:val="id-ID"/>
-              </w:rPr>
-              <w:t>{cek_kesesuaian}{/alat}</w:t>
+              <w:t>{jumlah}{/alat}</w:t>
             </w:r>
           </w:p>
         </w:tc>

</xml_diff>

<commit_message>
Refine CERTINDONESIA branding and manager signature
</commit_message>
<xml_diff>
--- a/templates/template.docx
+++ b/templates/template.docx
@@ -1761,7 +1761,7 @@
                                   <w:r>
                                     <w:drawing>
                                       <wp:inline distT="0" distB="0" distL="0" distR="0">
-                                        <wp:extent cx="720000" cy="720000"/>
+                                        <wp:extent cx="950000" cy="650000"/>
                                         <wp:effectExtent l="0" t="0" r="0" b="0"/>
                                         <wp:docPr id="9001" name="Tanda tangan dan cap Manajer Teknis" descr="Tanda tangan dan cap Manajer Teknis"/>
                                         <wp:cNvGraphicFramePr>
@@ -1776,6 +1776,7 @@
                                               </pic:nvPicPr>
                                               <pic:blipFill>
                                                 <a:blip r:embed="rId16"/>
+                                                <a:srcRect l="12000" t="21000" r="3000" b="19000"/>
                                                 <a:stretch>
                                                   <a:fillRect/>
                                                 </a:stretch>
@@ -1783,7 +1784,7 @@
                                               <pic:spPr>
                                                 <a:xfrm>
                                                   <a:off x="0" y="0"/>
-                                                  <a:ext cx="720000" cy="720000"/>
+                                                  <a:ext cx="950000" cy="650000"/>
                                                 </a:xfrm>
                                                 <a:prstGeom prst="rect">
                                                   <a:avLst/>

</xml_diff>